<commit_message>
optimize PDF layouts to reduce blank spaces and orphans
</commit_message>
<xml_diff>
--- a/Practical_File.docx
+++ b/Practical_File.docx
@@ -362,7 +362,7 @@
               </w:tabs>
               <w:autoSpaceDE w:val="0"/>
               <w:widowControl/>
-              <w:spacing w:line="372" w:lineRule="exact" w:before="3128" w:after="0"/>
+              <w:spacing w:line="372" w:lineRule="exact" w:before="1528" w:after="0"/>
               <w:ind w:left="912" w:right="0" w:firstLine="0"/>
               <w:jc w:val="left"/>
             </w:pPr>
@@ -577,7 +577,7 @@
               </w:tabs>
               <w:autoSpaceDE w:val="0"/>
               <w:widowControl/>
-              <w:spacing w:line="372" w:lineRule="exact" w:before="2328" w:after="0"/>
+              <w:spacing w:line="372" w:lineRule="exact" w:before="1328" w:after="0"/>
               <w:ind w:left="912" w:right="0" w:firstLine="0"/>
               <w:jc w:val="left"/>
             </w:pPr>
@@ -749,7 +749,7 @@
               <w:autoSpaceDN w:val="0"/>
               <w:autoSpaceDE w:val="0"/>
               <w:widowControl/>
-              <w:spacing w:line="388" w:lineRule="exact" w:before="2270" w:after="0"/>
+              <w:spacing w:line="388" w:lineRule="exact" w:before="1270" w:after="0"/>
               <w:ind w:left="720" w:right="0" w:firstLine="0"/>
               <w:jc w:val="left"/>
             </w:pPr>
@@ -1311,7 +1311,7 @@
               <w:autoSpaceDN w:val="0"/>
               <w:autoSpaceDE w:val="0"/>
               <w:widowControl/>
-              <w:spacing w:line="774" w:lineRule="exact" w:before="1096" w:after="0"/>
+              <w:spacing w:line="774" w:lineRule="exact" w:before="896" w:after="0"/>
               <w:ind w:left="0" w:right="0" w:firstLine="0"/>
               <w:jc w:val="center"/>
             </w:pPr>
@@ -1331,10 +1331,20 @@
               <w:autoSpaceDN w:val="0"/>
               <w:autoSpaceDE w:val="0"/>
               <w:widowControl/>
-              <w:spacing w:line="372" w:lineRule="exact" w:before="276" w:after="0"/>
+              <w:spacing w:line="390" w:lineRule="exact" w:before="276" w:after="0"/>
               <w:ind w:left="720" w:right="0" w:firstLine="0"/>
               <w:jc w:val="left"/>
             </w:pPr>
+            <w:r>
+              <w:rPr>
+                <w:rFonts w:ascii="Times" w:hAnsi="Times" w:eastAsia="Times"/>
+                <w:b/>
+                <w:i w:val="0"/>
+                <w:color w:val="000000"/>
+                <w:sz w:val="28"/>
+              </w:rPr>
+              <w:t>Aim:</w:t>
+            </w:r>
             <w:r>
               <w:rPr>
                 <w:rFonts w:ascii="Times" w:hAnsi="Times" w:eastAsia="Times"/>
@@ -1343,7 +1353,7 @@
                 <w:color w:val="000000"/>
                 <w:sz w:val="28"/>
               </w:rPr>
-              <w:t>Aim: To create a HTML page to display a Notice</w:t>
+              <w:t xml:space="preserve"> To create a HTML page to display a Notice</w:t>
             </w:r>
           </w:p>
           <w:p>
@@ -1351,7 +1361,7 @@
               <w:autoSpaceDN w:val="0"/>
               <w:autoSpaceDE w:val="0"/>
               <w:widowControl/>
-              <w:spacing w:line="554" w:lineRule="exact" w:before="710" w:after="0"/>
+              <w:spacing w:line="554" w:lineRule="exact" w:before="612" w:after="0"/>
               <w:ind w:left="720" w:right="3456" w:firstLine="0"/>
               <w:jc w:val="left"/>
             </w:pPr>
@@ -1381,7 +1391,7 @@
               <w:autoSpaceDN w:val="0"/>
               <w:autoSpaceDE w:val="0"/>
               <w:widowControl/>
-              <w:spacing w:line="554" w:lineRule="exact" w:before="912" w:after="0"/>
+              <w:spacing w:line="554" w:lineRule="exact" w:before="712" w:after="0"/>
               <w:ind w:left="720" w:right="4608" w:firstLine="0"/>
               <w:jc w:val="left"/>
             </w:pPr>

</xml_diff>